<commit_message>
Audit propuneri: completează Aparat locomotor + opționale Cap; scoate „harpon”
Audit de reconciliere între secțiunile de schiță din EDITORIAL-decisions.md și
propunerile din YAML. Un singur gol real găsit:
- Aparat locomotor §34.C — 3 propuneri recomandate lipsă: artrită septică,
  fractură de stres/insuficiență, durere cronică de picior (nevrom Morton etc.).
- Topicuri opționale (§34.D locomotor, §41.C Cap) — adăugate ca discuție da/nu.
Restul celor 13 capitole: complete (excluderile — defecografie/incontinență →
Obstetrică, feocromocitom PET → deja aplicat — sunt corecte).

Terminologie: scos și „harpon” → „reper metalic” (localizare preoperatorie mamară).

Co-Authored-By: Claude Sonnet 5 <noreply@anthropic.com>
Claude-Session: https://claude.ai/code/session_01CB1qxeCwYtJ1rmMiMw8agr
</commit_message>
<xml_diff>
--- a/pentru-editori/10-cap/10-cap.docx
+++ b/pentru-editori/10-cap/10-cap.docx
@@ -347,6 +347,65 @@
           <w:p>
             <w:r>
               <w:t>• Rămâne fragmentat</w:t>
+            </w:r>
+          </w:p>
+        </w:tc>
+        <w:tc>
+          <w:tcPr>
+            <w:tcW w:type="dxa" w:w="2880"/>
+          </w:tcPr>
+          <w:p>
+            <w:r/>
+            <w:r>
+              <w:rPr>
+                <w:b w:val="0"/>
+                <w:i w:val="0"/>
+              </w:rPr>
+            </w:r>
+          </w:p>
+        </w:tc>
+        <w:tc>
+          <w:tcPr>
+            <w:tcW w:type="dxa" w:w="2880"/>
+          </w:tcPr>
+          <w:p>
+            <w:r/>
+            <w:r>
+              <w:rPr>
+                <w:b w:val="0"/>
+                <w:i w:val="0"/>
+              </w:rPr>
+            </w:r>
+          </w:p>
+        </w:tc>
+      </w:tr>
+      <w:tr>
+        <w:tc>
+          <w:tcPr>
+            <w:tcW w:type="dxa" w:w="6400"/>
+          </w:tcPr>
+          <w:p>
+            <w:r/>
+            <w:r>
+              <w:rPr>
+                <w:b/>
+              </w:rPr>
+              <w:t>Topicuri ORL opționale — de adăugat dacă se dorește acoperire exhaustivă?</w:t>
+            </w:r>
+          </w:p>
+          <w:p>
+            <w:r>
+              <w:t>Boala Menière / hidrops endolimfatic (IRM cu gadolinium tardiv); malformații/displazii ale urechii interne (bilanț pre-implant cohlear); nevralgie de trigemen (IRM cu secvențe de conflict neuro-vascular).</w:t>
+            </w:r>
+          </w:p>
+          <w:p>
+            <w:r>
+              <w:t>• Se adaugă</w:t>
+            </w:r>
+          </w:p>
+          <w:p>
+            <w:r>
+              <w:t>• Nu se adaugă</w:t>
             </w:r>
           </w:p>
         </w:tc>

</xml_diff>